<commit_message>
Restore approved Computer Science topics and Week 5 arithmetic plans
</commit_message>
<xml_diff>
--- a/materials/y10-11/computer-science/term1/week05/Y10-11 Computer Science T1 W05 Lesson Plan.docx
+++ b/materials/y10-11/computer-science/term1/week05/Y10-11 Computer Science T1 W05 Lesson Plan.docx
@@ -233,10 +233,11 @@
             </w:pPr>
             <w:r>
               <w:rPr>
-                <w:sz w:val="18"/>
-                <w:szCs w:val="18"/>
-              </w:rPr>
-              <w:t>5</w:t>
+                <w:b w:val="0"/>
+                <w:sz w:val="18"/>
+                <w:szCs w:val="18"/>
+              </w:rPr>
+              <w:t>5 (Term 1)</w:t>
             </w:r>
           </w:p>
         </w:tc>
@@ -521,12 +522,13 @@
       </w:pPr>
       <w:r>
         <w:rPr>
+          <w:b w:val="0"/>
           <w:color w:val="auto"/>
           <w:sz w:val="20"/>
           <w:szCs w:val="20"/>
           <w:u w:val="single"/>
         </w:rPr>
-        <w:t>Students will develop their understanding of computational thinking through decomposition and abstraction. They will learn how to break a complex problem into smaller, manageable sub-problems and how abstraction can be used to remove unnecessary detail when designing a solution. Students will also identify inputs, outputs, processing and initialisation requirements when analysing a problem and apply these techniques to a computer-based problem.</w:t>
+        <w:t>Students will develop their understanding of arithmetic operators and expressions in Python. They will evaluate calculations using operator precedence and parentheses and explain the purposes of integer division and remainder. Students will then build a calculator using numeric inputs and labelled output. They will predict results, compare them with program output and use normal, zero and decimal values to identify and correct calculation errors.</w:t>
       </w:r>
     </w:p>
     <w:p>
@@ -553,64 +555,25 @@
       </w:r>
       <w:r>
         <w:rPr>
-          <w:b/>
-          <w:bCs/>
-          <w:color w:val="auto"/>
-          <w:sz w:val="22"/>
-          <w:szCs w:val="22"/>
-        </w:rPr>
-        <w:br/>
-      </w:r>
-      <w:r>
-        <w:rPr>
-          <w:color w:val="auto"/>
-          <w:sz w:val="20"/>
-          <w:szCs w:val="20"/>
-          <w:u w:val="single"/>
-        </w:rPr>
-        <w:t>Teacher questioning, class discussion, analysis of worked examples and the completed problem-solving activity. Students should be able to explain decomposition and abstraction in their own words, identify sub-problems within a larger problem and distinguish between input, output and processing requirements when analysing a problem.</w:t>
-      </w:r>
-      <w:r>
-        <w:rPr>
+          <w:b w:val="0"/>
           <w:color w:val="auto"/>
           <w:sz w:val="20"/>
           <w:szCs w:val="20"/>
           <w:u w:val="single"/>
         </w:rPr>
         <w:br/>
-      </w:r>
-      <w:r>
-        <w:rPr>
-          <w:color w:val="auto"/>
-          <w:sz w:val="20"/>
-          <w:szCs w:val="20"/>
-          <w:u w:val="single"/>
-        </w:rPr>
-        <w:br/>
+        <w:t>Teacher questioning, discussion of worked examples, the completed student tasks and the final checks in both lessons. Compare hand calculations with program results and explain one use of %. Check three test cases and ask students to diagnose a deliberately incorrect expression. Check that students can explain their reasoning and apply the skill without relying on the worked example.</w:t>
       </w:r>
       <w:r>
         <w:rPr>
           <w:b/>
           <w:bCs/>
           <w:color w:val="1F4E79"/>
+          <w:sz w:val="22"/>
         </w:rPr>
-        <w:t>LESSON SLOTS</w:t>
-      </w:r>
-      <w:r>
-        <w:rPr>
-          <w:b/>
-          <w:bCs/>
-          <w:color w:val="1F4E79"/>
-        </w:rPr>
-        <w:t xml:space="preserve"> - MONDAY &amp; </w:t>
-      </w:r>
-      <w:r>
-        <w:rPr>
-          <w:b/>
-          <w:bCs/>
-          <w:color w:val="1F4E79"/>
-        </w:rPr>
-        <w:t>FRIDAY</w:t>
+        <w:br/>
+        <w:br/>
+        <w:t>LESSON SLOTS - MONDAY &amp; FRIDAY</w:t>
       </w:r>
     </w:p>
     <w:tbl>
@@ -848,10 +811,8 @@
             </w:pPr>
             <w:r>
               <w:rPr>
-                <w:b/>
-                <w:bCs/>
-                <w:sz w:val="20"/>
-                <w:szCs w:val="20"/>
+                <w:b w:val="0"/>
+                <w:sz w:val="18"/>
               </w:rPr>
               <w:t>1</w:t>
             </w:r>
@@ -877,8 +838,8 @@
             </w:pPr>
             <w:r>
               <w:rPr>
-                <w:sz w:val="18"/>
-                <w:szCs w:val="18"/>
+                <w:b w:val="0"/>
+                <w:sz w:val="18"/>
               </w:rPr>
               <w:t>21 September 2026</w:t>
             </w:r>
@@ -904,10 +865,10 @@
             </w:pPr>
             <w:r>
               <w:rPr>
-                <w:sz w:val="18"/>
-                <w:szCs w:val="18"/>
-              </w:rPr>
-              <w:t>By the end of this lesson, students will be able to explain computational thinking, decomposition and abstraction. They will be able to break a complex problem into smaller sub-problems and identify why decomposition makes a problem easier to solve.</w:t>
+                <w:b w:val="0"/>
+                <w:sz w:val="18"/>
+              </w:rPr>
+              <w:t>By the end of this lesson, students will be able to evaluate arithmetic expressions using operator precedence.</w:t>
             </w:r>
           </w:p>
         </w:tc>
@@ -933,20 +894,50 @@
             <w:r>
               <w:rPr>
                 <w:b/>
-                <w:bCs/>
+                <w:sz w:val="18"/>
+              </w:rPr>
+              <w:t>H:</w:t>
+            </w:r>
+            <w:r>
+              <w:rPr>
+                <w:b w:val="0"/>
+                <w:sz w:val="18"/>
+              </w:rPr>
+              <w:t xml:space="preserve"> Predict the difference between 3 + 4 * 2 and (3 + 4) * 2. Invite students to explain their prediction before demonstrating the example. Use their responses to identify the idea that needs clarification.</w:t>
+            </w:r>
+          </w:p>
+          <w:p>
+            <w:pPr>
+              <w:spacing w:line="240" w:lineRule="auto"/>
+              <w:rPr>
                 <w:sz w:val="18"/>
                 <w:szCs w:val="18"/>
                 <w:lang w:val="en-US"/>
               </w:rPr>
-              <w:t>H:</w:t>
-            </w:r>
-            <w:r>
+            </w:pPr>
+          </w:p>
+          <w:p>
+            <w:pPr>
+              <w:spacing w:line="240" w:lineRule="auto"/>
               <w:rPr>
                 <w:sz w:val="18"/>
                 <w:szCs w:val="18"/>
                 <w:lang w:val="en-US"/>
               </w:rPr>
-              <w:t xml:space="preserve"> Present a familiar complex problem, such as creating a computer version of a game. Ask: “If we had to program this entire game, could we solve everything at once?” Ask students to suggest smaller tasks that would need to be completed.</w:t>
+            </w:pPr>
+            <w:r>
+              <w:rPr>
+                <w:b/>
+                <w:sz w:val="18"/>
+              </w:rPr>
+              <w:t>ID:</w:t>
+            </w:r>
+            <w:r>
+              <w:rPr>
+                <w:b w:val="0"/>
+                <w:sz w:val="18"/>
+              </w:rPr>
+              <w:t xml:space="preserve"> Explain arithmetic operators, parentheses, integer division and remainder. Explain addition, subtraction, multiplication and division before comparing /, // and %. Discuss how parentheses change the order of evaluation and why the program must use numeric values when performing arithmetic.</w:t>
             </w:r>
           </w:p>
           <w:p>
@@ -971,20 +962,50 @@
             <w:r>
               <w:rPr>
                 <w:b/>
-                <w:bCs/>
+                <w:sz w:val="18"/>
+              </w:rPr>
+              <w:t>WD:</w:t>
+            </w:r>
+            <w:r>
+              <w:rPr>
+                <w:b w:val="0"/>
+                <w:sz w:val="18"/>
+              </w:rPr>
+              <w:t xml:space="preserve"> Evaluate and run expressions for sharing items and calculating a remainder. Calculate 3 + 4 * 2 and (3 + 4) * 2 by hand, then compare the Python results. Share 17 items between 5 people and explain how // gives the whole-number share while % gives the number left over.</w:t>
+            </w:r>
+          </w:p>
+          <w:p>
+            <w:pPr>
+              <w:spacing w:line="240" w:lineRule="auto"/>
+              <w:rPr>
                 <w:sz w:val="18"/>
                 <w:szCs w:val="18"/>
                 <w:lang w:val="en-US"/>
               </w:rPr>
-              <w:t>ID:</w:t>
-            </w:r>
-            <w:r>
+            </w:pPr>
+          </w:p>
+          <w:p>
+            <w:pPr>
+              <w:spacing w:line="240" w:lineRule="auto"/>
               <w:rPr>
                 <w:sz w:val="18"/>
                 <w:szCs w:val="18"/>
                 <w:lang w:val="en-US"/>
               </w:rPr>
-              <w:t xml:space="preserve"> Introduce computational thinking and explain that computer scientists define and analyse problems before creating algorithms and programs. Introduce decomposition as breaking a problem into smaller, more manageable sub-problems. Explain that decomposition can make errors easier to identify and allows different parts of a problem to be worked on separately.</w:t>
+            </w:pPr>
+            <w:r>
+              <w:rPr>
+                <w:b/>
+                <w:sz w:val="18"/>
+              </w:rPr>
+              <w:t>YD:</w:t>
+            </w:r>
+            <w:r>
+              <w:rPr>
+                <w:b w:val="0"/>
+                <w:sz w:val="18"/>
+              </w:rPr>
+              <w:t xml:space="preserve"> Write a program that calculates a basket total and shares a whole number of items equally. Students record expressions and predicted results before running them. Their basket program uses clear variable names and labelled totals; their sharing calculation reports both the whole-number share and the remaining items.</w:t>
             </w:r>
           </w:p>
           <w:p>
@@ -1009,105 +1030,16 @@
             <w:r>
               <w:rPr>
                 <w:b/>
-                <w:bCs/>
-                <w:sz w:val="18"/>
-                <w:szCs w:val="18"/>
-                <w:lang w:val="en-US"/>
-              </w:rPr>
-              <w:t>WD:</w:t>
-            </w:r>
-            <w:r>
-              <w:rPr>
-                <w:sz w:val="18"/>
-                <w:szCs w:val="18"/>
-                <w:lang w:val="en-US"/>
-              </w:rPr>
-              <w:t xml:space="preserve"> Examine the textbook's noughts and crosses example. Identify </w:t>
-            </w:r>
-            <w:r>
-              <w:rPr>
-                <w:sz w:val="18"/>
-                <w:szCs w:val="18"/>
-                <w:lang w:val="en-US"/>
-              </w:rPr>
-              <w:lastRenderedPageBreak/>
-              <w:t>the different sub-problems, including designing the 3×3 interface, tracking selected squares, deciding the computer's move and checking when the game is over. Discuss how solving these smaller problems contributes to solving the complete problem.</w:t>
-            </w:r>
-          </w:p>
-          <w:p>
-            <w:pPr>
-              <w:spacing w:line="240" w:lineRule="auto"/>
-              <w:rPr>
-                <w:sz w:val="18"/>
-                <w:szCs w:val="18"/>
-                <w:lang w:val="en-US"/>
-              </w:rPr>
-            </w:pPr>
-          </w:p>
-          <w:p>
-            <w:pPr>
-              <w:spacing w:line="240" w:lineRule="auto"/>
-              <w:rPr>
-                <w:sz w:val="18"/>
-                <w:szCs w:val="18"/>
-                <w:lang w:val="en-US"/>
-              </w:rPr>
-            </w:pPr>
-            <w:r>
-              <w:rPr>
-                <w:b/>
-                <w:bCs/>
-                <w:sz w:val="18"/>
-                <w:szCs w:val="18"/>
-                <w:lang w:val="en-US"/>
-              </w:rPr>
-              <w:t>YD:</w:t>
-            </w:r>
-            <w:r>
-              <w:rPr>
-                <w:sz w:val="18"/>
-                <w:szCs w:val="18"/>
-                <w:lang w:val="en-US"/>
-              </w:rPr>
-              <w:t xml:space="preserve"> Students choose a familiar computer-based problem and decompose it into at least four smaller sub-problems. They should give a short description of what needs to be solved for each sub-problem.</w:t>
-            </w:r>
-          </w:p>
-          <w:p>
-            <w:pPr>
-              <w:spacing w:line="240" w:lineRule="auto"/>
-              <w:rPr>
-                <w:sz w:val="18"/>
-                <w:szCs w:val="18"/>
-                <w:lang w:val="en-US"/>
-              </w:rPr>
-            </w:pPr>
-          </w:p>
-          <w:p>
-            <w:pPr>
-              <w:spacing w:line="240" w:lineRule="auto"/>
-              <w:rPr>
-                <w:sz w:val="18"/>
-                <w:szCs w:val="18"/>
-                <w:lang w:val="en-US"/>
-              </w:rPr>
-            </w:pPr>
-            <w:r>
-              <w:rPr>
-                <w:b/>
-                <w:bCs/>
-                <w:sz w:val="18"/>
-                <w:szCs w:val="18"/>
-                <w:lang w:val="en-US"/>
+                <w:sz w:val="18"/>
               </w:rPr>
               <w:t>C:</w:t>
             </w:r>
             <w:r>
               <w:rPr>
-                <w:sz w:val="18"/>
-                <w:szCs w:val="18"/>
-                <w:lang w:val="en-US"/>
-              </w:rPr>
-              <w:t xml:space="preserve"> Ask selected students to share their decomposed problems. Exit check: students explain what decomposition means and give one benefit of using it when solving a programming problem.</w:t>
+                <w:b w:val="0"/>
+                <w:sz w:val="18"/>
+              </w:rPr>
+              <w:t xml:space="preserve"> Compare hand calculations with program results and explain one use of %. Ask students to support their answer with a specific example from their work, and record any misconception that needs a further demonstration.</w:t>
             </w:r>
           </w:p>
         </w:tc>
@@ -1133,70 +1065,51 @@
             <w:r>
               <w:rPr>
                 <w:b/>
-                <w:bCs/>
+                <w:sz w:val="18"/>
+              </w:rPr>
+              <w:t>Support:</w:t>
+            </w:r>
+            <w:r>
+              <w:rPr>
+                <w:b w:val="0"/>
+                <w:sz w:val="18"/>
+              </w:rPr>
+              <w:t xml:space="preserve"> Provide an operator reference, a worked precedence example and a table for predictions. Use physical counters for integer division and remainder, then help students translate the calculation into an expression before working independently.</w:t>
+            </w:r>
+          </w:p>
+          <w:p>
+            <w:pPr>
+              <w:spacing w:line="240" w:lineRule="auto"/>
+              <w:rPr>
                 <w:sz w:val="18"/>
                 <w:szCs w:val="18"/>
                 <w:lang w:val="en-US"/>
               </w:rPr>
-              <w:lastRenderedPageBreak/>
-              <w:t>Support:</w:t>
-            </w:r>
-            <w:r>
+            </w:pPr>
+          </w:p>
+          <w:p>
+            <w:pPr>
+              <w:spacing w:line="240" w:lineRule="auto"/>
               <w:rPr>
                 <w:sz w:val="18"/>
                 <w:szCs w:val="18"/>
                 <w:lang w:val="en-US"/>
               </w:rPr>
-              <w:t xml:space="preserve"> Provide a partially completed decomposition example and guide students through identifying the main problem and its smaller parts. Use the noughts and crosses example as a model and provide prompts such as “What does the user need to do?”, “What does the computer need to do?” and “How will the program know when it is finished?”</w:t>
-            </w:r>
-          </w:p>
-          <w:p>
-            <w:pPr>
-              <w:spacing w:line="240" w:lineRule="auto"/>
-              <w:rPr>
-                <w:sz w:val="18"/>
-                <w:szCs w:val="18"/>
-                <w:lang w:val="en-US"/>
-              </w:rPr>
-            </w:pPr>
-          </w:p>
-          <w:p>
-            <w:pPr>
-              <w:spacing w:line="240" w:lineRule="auto"/>
-              <w:rPr>
-                <w:sz w:val="18"/>
-                <w:szCs w:val="18"/>
-                <w:lang w:val="en-US"/>
-              </w:rPr>
-            </w:pPr>
-            <w:r>
-              <w:rPr>
-                <w:b/>
-                <w:bCs/>
-                <w:sz w:val="18"/>
-                <w:szCs w:val="18"/>
-                <w:lang w:val="en-US"/>
+            </w:pPr>
+            <w:r>
+              <w:rPr>
+                <w:b/>
+                <w:sz w:val="18"/>
               </w:rPr>
               <w:t>Extension:</w:t>
             </w:r>
             <w:r>
               <w:rPr>
-                <w:sz w:val="18"/>
-                <w:szCs w:val="18"/>
-                <w:lang w:val="en-US"/>
-              </w:rPr>
-              <w:t xml:space="preserve"> Students decompose a more complex problem into a greater number of sub-problems and explain how different programmers or subprograms could work on the separate parts. Students who finish confidently can identify which sub-problems may need to interact with each other.</w:t>
-            </w:r>
-          </w:p>
-          <w:p>
-            <w:pPr>
-              <w:spacing w:line="240" w:lineRule="auto"/>
-              <w:rPr>
-                <w:sz w:val="18"/>
-                <w:szCs w:val="18"/>
-                <w:lang w:val="en-US"/>
-              </w:rPr>
-            </w:pPr>
+                <w:b w:val="0"/>
+                <w:sz w:val="18"/>
+              </w:rPr>
+              <w:t xml:space="preserve"> Students investigate calculations involving zero and decimal values and explain why division by zero cannot produce a normal numeric result. They compare two equivalent expressions and justify where parentheses improve readability.</w:t>
+            </w:r>
           </w:p>
         </w:tc>
       </w:tr>
@@ -1227,10 +1140,8 @@
             </w:pPr>
             <w:r>
               <w:rPr>
-                <w:b/>
-                <w:bCs/>
-                <w:sz w:val="18"/>
-                <w:szCs w:val="18"/>
+                <w:b w:val="0"/>
+                <w:sz w:val="18"/>
               </w:rPr>
               <w:t>2</w:t>
             </w:r>
@@ -1256,8 +1167,8 @@
             </w:pPr>
             <w:r>
               <w:rPr>
-                <w:sz w:val="18"/>
-                <w:szCs w:val="18"/>
+                <w:b w:val="0"/>
+                <w:sz w:val="18"/>
               </w:rPr>
               <w:t>25 September 2026</w:t>
             </w:r>
@@ -1284,10 +1195,10 @@
             </w:pPr>
             <w:r>
               <w:rPr>
-                <w:sz w:val="18"/>
-                <w:szCs w:val="18"/>
-              </w:rPr>
-              <w:t>By the end of this lesson, students will be able to explain abstraction and identify the essential details required to model a real-world problem. They will identify inputs, outputs, processing and initialisation requirements when designing a solution.</w:t>
+                <w:b w:val="0"/>
+                <w:sz w:val="18"/>
+              </w:rPr>
+              <w:t>By the end of this lesson, students will be able to build and test a calculator with numeric inputs.</w:t>
             </w:r>
           </w:p>
         </w:tc>
@@ -1313,20 +1224,50 @@
             <w:r>
               <w:rPr>
                 <w:b/>
-                <w:bCs/>
+                <w:sz w:val="18"/>
+              </w:rPr>
+              <w:t>H:</w:t>
+            </w:r>
+            <w:r>
+              <w:rPr>
+                <w:b w:val="0"/>
+                <w:sz w:val="18"/>
+              </w:rPr>
+              <w:t xml:space="preserve"> Present a calculator that joins digits instead of adding them. Invite students to explain their prediction before demonstrating the example. Use their responses to identify the idea that needs clarification.</w:t>
+            </w:r>
+          </w:p>
+          <w:p>
+            <w:pPr>
+              <w:spacing w:line="240" w:lineRule="auto"/>
+              <w:rPr>
                 <w:sz w:val="18"/>
                 <w:szCs w:val="18"/>
                 <w:lang w:val="en-US"/>
               </w:rPr>
-              <w:t>H:</w:t>
-            </w:r>
-            <w:r>
+            </w:pPr>
+          </w:p>
+          <w:p>
+            <w:pPr>
+              <w:spacing w:line="240" w:lineRule="auto"/>
               <w:rPr>
                 <w:sz w:val="18"/>
                 <w:szCs w:val="18"/>
                 <w:lang w:val="en-US"/>
               </w:rPr>
-              <w:t xml:space="preserve"> Show a real-world object or situation, such as a die or a journey. Ask: “If we wanted to create a computer model of this, would we need every detail of the real object?” Discuss which details are important and which could be ignored.</w:t>
+            </w:pPr>
+            <w:r>
+              <w:rPr>
+                <w:b/>
+                <w:sz w:val="18"/>
+              </w:rPr>
+              <w:t>ID:</w:t>
+            </w:r>
+            <w:r>
+              <w:rPr>
+                <w:b w:val="0"/>
+                <w:sz w:val="18"/>
+              </w:rPr>
+              <w:t xml:space="preserve"> Review conversion, clear variable names and labelled output. Explain how numeric conversion, arithmetic expressions and clear output work together in a calculator. Discuss the need to specify which operations are supported and to test the requirements rather than checking only whether the program runs.</w:t>
             </w:r>
           </w:p>
           <w:p>
@@ -1351,20 +1292,50 @@
             <w:r>
               <w:rPr>
                 <w:b/>
-                <w:bCs/>
+                <w:sz w:val="18"/>
+              </w:rPr>
+              <w:t>WD:</w:t>
+            </w:r>
+            <w:r>
+              <w:rPr>
+                <w:b w:val="0"/>
+                <w:sz w:val="18"/>
+              </w:rPr>
+              <w:t xml:space="preserve"> Plan and code a two-input calculator for sum, difference and product. Plan two numeric inputs, convert them using float(), and calculate their sum, difference and product. Predict the results for 4 and 2, then change one input to a decimal and compare the output with a hand calculation.</w:t>
+            </w:r>
+          </w:p>
+          <w:p>
+            <w:pPr>
+              <w:spacing w:line="240" w:lineRule="auto"/>
+              <w:rPr>
                 <w:sz w:val="18"/>
                 <w:szCs w:val="18"/>
                 <w:lang w:val="en-US"/>
               </w:rPr>
-              <w:t>ID:</w:t>
-            </w:r>
-            <w:r>
+            </w:pPr>
+          </w:p>
+          <w:p>
+            <w:pPr>
+              <w:spacing w:line="240" w:lineRule="auto"/>
               <w:rPr>
                 <w:sz w:val="18"/>
                 <w:szCs w:val="18"/>
                 <w:lang w:val="en-US"/>
               </w:rPr>
-              <w:t xml:space="preserve"> Introduce abstraction as removing or hiding unnecessary detail so that only the important points remain. Explain how programmers use abstraction when creating algorithms and models. Discuss the textbook's virtual die example and how only the essential behaviour of a real die needs to be represented.</w:t>
+            </w:pPr>
+            <w:r>
+              <w:rPr>
+                <w:b/>
+                <w:sz w:val="18"/>
+              </w:rPr>
+              <w:t>YD:</w:t>
+            </w:r>
+            <w:r>
+              <w:rPr>
+                <w:b w:val="0"/>
+                <w:sz w:val="18"/>
+              </w:rPr>
+              <w:t xml:space="preserve"> Complete the calculator and test positive, zero and decimal values; record expected and actual results. Students build and save the calculator, using meaningful identifiers and labelled output for each operation. They record expected and actual results for positive, zero and decimal inputs and correct an expression that fails a test.</w:t>
             </w:r>
           </w:p>
           <w:p>
@@ -1389,105 +1360,16 @@
             <w:r>
               <w:rPr>
                 <w:b/>
-                <w:bCs/>
-                <w:sz w:val="18"/>
-                <w:szCs w:val="18"/>
-                <w:lang w:val="en-US"/>
-              </w:rPr>
-              <w:t>WD:</w:t>
-            </w:r>
-            <w:r>
-              <w:rPr>
-                <w:sz w:val="18"/>
-                <w:szCs w:val="18"/>
-                <w:lang w:val="en-US"/>
-              </w:rPr>
-              <w:t xml:space="preserve"> Examine the noughts and crosses example and identify its inputs, outputs, processing and </w:t>
-            </w:r>
-            <w:r>
-              <w:rPr>
-                <w:sz w:val="18"/>
-                <w:szCs w:val="18"/>
-                <w:lang w:val="en-US"/>
-              </w:rPr>
-              <w:lastRenderedPageBreak/>
-              <w:t>initialisation requirements. Discuss how a programmer can work at a high level of abstraction before adding more detail. Introduce the idea of using separate subprograms for specific tasks.</w:t>
-            </w:r>
-          </w:p>
-          <w:p>
-            <w:pPr>
-              <w:spacing w:line="240" w:lineRule="auto"/>
-              <w:rPr>
-                <w:sz w:val="18"/>
-                <w:szCs w:val="18"/>
-                <w:lang w:val="en-US"/>
-              </w:rPr>
-            </w:pPr>
-          </w:p>
-          <w:p>
-            <w:pPr>
-              <w:spacing w:line="240" w:lineRule="auto"/>
-              <w:rPr>
-                <w:sz w:val="18"/>
-                <w:szCs w:val="18"/>
-                <w:lang w:val="en-US"/>
-              </w:rPr>
-            </w:pPr>
-            <w:r>
-              <w:rPr>
-                <w:b/>
-                <w:bCs/>
-                <w:sz w:val="18"/>
-                <w:szCs w:val="18"/>
-                <w:lang w:val="en-US"/>
-              </w:rPr>
-              <w:t>YD:</w:t>
-            </w:r>
-            <w:r>
-              <w:rPr>
-                <w:sz w:val="18"/>
-                <w:szCs w:val="18"/>
-                <w:lang w:val="en-US"/>
-              </w:rPr>
-              <w:t xml:space="preserve"> Students analyse the textbook's Creating a Quiz Game activity. In groups or pairs, they list the requirements, decompose the problem into sub-problems and identify the inputs, outputs and processing requirements. Students should also describe how the spinning wheel could be modelled.</w:t>
-            </w:r>
-          </w:p>
-          <w:p>
-            <w:pPr>
-              <w:spacing w:line="240" w:lineRule="auto"/>
-              <w:rPr>
-                <w:sz w:val="18"/>
-                <w:szCs w:val="18"/>
-                <w:lang w:val="en-US"/>
-              </w:rPr>
-            </w:pPr>
-          </w:p>
-          <w:p>
-            <w:pPr>
-              <w:spacing w:line="240" w:lineRule="auto"/>
-              <w:rPr>
-                <w:sz w:val="18"/>
-                <w:szCs w:val="18"/>
-                <w:lang w:val="en-US"/>
-              </w:rPr>
-            </w:pPr>
-            <w:r>
-              <w:rPr>
-                <w:b/>
-                <w:bCs/>
-                <w:sz w:val="18"/>
-                <w:szCs w:val="18"/>
-                <w:lang w:val="en-US"/>
+                <w:sz w:val="18"/>
               </w:rPr>
               <w:t>C:</w:t>
             </w:r>
             <w:r>
               <w:rPr>
-                <w:sz w:val="18"/>
-                <w:szCs w:val="18"/>
-                <w:lang w:val="en-US"/>
-              </w:rPr>
-              <w:t xml:space="preserve"> Ask groups to present one part of their analysis. Exit check: students define abstraction in their own words and identify one input, one output and one processing requirement from the quiz game.</w:t>
+                <w:b w:val="0"/>
+                <w:sz w:val="18"/>
+              </w:rPr>
+              <w:t xml:space="preserve"> Check three test cases and ask students to diagnose a deliberately incorrect expression. Ask students to support their answer with a specific example from their work, and record any misconception that needs a further demonstration.</w:t>
             </w:r>
           </w:p>
         </w:tc>
@@ -1513,70 +1395,51 @@
             <w:r>
               <w:rPr>
                 <w:b/>
-                <w:bCs/>
+                <w:sz w:val="18"/>
+              </w:rPr>
+              <w:t>Support:</w:t>
+            </w:r>
+            <w:r>
+              <w:rPr>
+                <w:b w:val="0"/>
+                <w:sz w:val="18"/>
+              </w:rPr>
+              <w:t xml:space="preserve"> Provide an input-process-output planning sheet and a partially completed calculator. Model the sum calculation, then ask students to write the difference and product expressions. Use a test table with one completed example before removing the scaffold.</w:t>
+            </w:r>
+          </w:p>
+          <w:p>
+            <w:pPr>
+              <w:spacing w:line="240" w:lineRule="auto"/>
+              <w:rPr>
                 <w:sz w:val="18"/>
                 <w:szCs w:val="18"/>
                 <w:lang w:val="en-US"/>
               </w:rPr>
-              <w:lastRenderedPageBreak/>
-              <w:t>Support:</w:t>
-            </w:r>
-            <w:r>
+            </w:pPr>
+          </w:p>
+          <w:p>
+            <w:pPr>
+              <w:spacing w:line="240" w:lineRule="auto"/>
               <w:rPr>
                 <w:sz w:val="18"/>
                 <w:szCs w:val="18"/>
                 <w:lang w:val="en-US"/>
               </w:rPr>
-              <w:t xml:space="preserve"> Provide a template divided into Problem → Sub-problems → Inputs → Outputs → Processing. Model one example before students begin. Provide vocabulary prompts for abstraction, input, output, processing, initialisation and subprogram.</w:t>
-            </w:r>
-          </w:p>
-          <w:p>
-            <w:pPr>
-              <w:spacing w:line="240" w:lineRule="auto"/>
-              <w:rPr>
-                <w:sz w:val="18"/>
-                <w:szCs w:val="18"/>
-                <w:lang w:val="en-US"/>
-              </w:rPr>
-            </w:pPr>
-          </w:p>
-          <w:p>
-            <w:pPr>
-              <w:spacing w:line="240" w:lineRule="auto"/>
-              <w:rPr>
-                <w:sz w:val="18"/>
-                <w:szCs w:val="18"/>
-                <w:lang w:val="en-US"/>
-              </w:rPr>
-            </w:pPr>
-            <w:r>
-              <w:rPr>
-                <w:b/>
-                <w:bCs/>
-                <w:sz w:val="18"/>
-                <w:szCs w:val="18"/>
-                <w:lang w:val="en-US"/>
+            </w:pPr>
+            <w:r>
+              <w:rPr>
+                <w:b/>
+                <w:sz w:val="18"/>
               </w:rPr>
               <w:t>Extension:</w:t>
             </w:r>
             <w:r>
               <w:rPr>
-                <w:sz w:val="18"/>
-                <w:szCs w:val="18"/>
-                <w:lang w:val="en-US"/>
-              </w:rPr>
-              <w:t xml:space="preserve"> Students identify different levels of abstraction within the quiz game and explain which details can be hidden at a higher level. Students who finish confidently can write simple pseudocode describing how the wheel could select one of the four colours.</w:t>
-            </w:r>
-          </w:p>
-          <w:p>
-            <w:pPr>
-              <w:spacing w:line="240" w:lineRule="auto"/>
-              <w:rPr>
-                <w:sz w:val="18"/>
-                <w:szCs w:val="18"/>
-                <w:lang w:val="en-US"/>
-              </w:rPr>
-            </w:pPr>
+                <w:b w:val="0"/>
+                <w:sz w:val="18"/>
+              </w:rPr>
+              <w:t xml:space="preserve"> Students add division with a clear zero-divisor check using a supplied decision structure, or describe the necessary check in plain language. They justify test values that reveal string concatenation or an incorrect arithmetic operator.</w:t>
+            </w:r>
           </w:p>
         </w:tc>
       </w:tr>
@@ -1946,31 +1809,23 @@
         </w:rPr>
       </w:pPr>
       <w:r>
-        <w:t>● Student Book / textbook pages 23–28</w:t>
-      </w:r>
-      <w:r>
+        <w:rPr>
+          <w:b w:val="0"/>
+          <w:sz w:val="20"/>
+        </w:rPr>
+        <w:t>● Pearson Edexcel International GCSE Computer Science Student Book: Chapter 5</w:t>
         <w:br/>
-        <w:t>● Whiteboard / display screen</w:t>
-      </w:r>
-      <w:r>
+        <w:t>● Teacher computer and classroom display</w:t>
         <w:br/>
-        <w:t>● Noughts and crosses example from the textbook</w:t>
-      </w:r>
-      <w:r>
+        <w:t>● Classroom computers with Python 3 editor and individual save folders</w:t>
         <w:br/>
-        <w:t>● Quiz Game activity from the textbook</w:t>
-      </w:r>
-      <w:r>
+        <w:t>● Prepared algorithm, tracing or Python practice tasks aligned with the lesson objectives</w:t>
         <w:br/>
-        <w:t>● Problem decomposition worksheet / notebook</w:t>
-      </w:r>
-      <w:r>
+        <w:t>● Whiteboard and markers</w:t>
         <w:br/>
-        <w:t>● Pseudocode template</w:t>
-      </w:r>
-      <w:r>
+        <w:t>● Student notebooks and pencils</w:t>
         <w:br/>
-        <w:t>● Computers, if students are completing the programming extension</w:t>
+        <w:t>● Success criteria, test tables and teacher observation checklist</w:t>
       </w:r>
     </w:p>
     <w:p>

</xml_diff>